<commit_message>
Update Ropener user guide and platter 3MF
Update binary files: revise the Ropener User Guide (docs/Ropener User Guide.docx) and refresh the 3D print model for the platter (hardware/plastics/platter-all.3mf). These changes deliver documentation updates and an updated platter 3MF for printing/assembly.
</commit_message>
<xml_diff>
--- a/docs/Ropener User Guide.docx
+++ b/docs/Ropener User Guide.docx
@@ -955,7 +955,7 @@
     </w:p>
     <w:p>
       <w:r>
-        <w:t>The two trailing parts (for example “,M3.2.0,M11.1.0”) are the daylight-saving rules: switch forward on the 2nd Sunday of March and back on the 1st Sunday of November — the current U.S. rule. If your area does not observe daylight saving time, use the “without DST” value, which has no trailing rules.</w:t>
+        <w:t>The trailing parts (for example “,M3.2.0,M11.1.0”) are the daylight-saving rules. The U.S. switches on the 2nd Sunday of March and the 1st Sunday of November; the European Union switches on the last Sunday of March and the last Sunday of October. The tables in Section 8 already encode the correct rule for each region — just copy the value exactly. If your area does not observe daylight saving time, use the “without DST” value, which has no trailing rules.</w:t>
       </w:r>
     </w:p>
     <w:p>
@@ -963,12 +963,20 @@
         <w:pStyle w:val="Heading1"/>
       </w:pPr>
       <w:r>
-        <w:t>8. U.S. Timezone POSIX Strings</w:t>
+        <w:t>8. Timezone POSIX Strings</w:t>
       </w:r>
     </w:p>
     <w:p>
       <w:r>
         <w:t>Find your region below and copy the matching string into the Timezone box. Use the “With DST” column if your area changes its clocks twice a year; use “Without DST (standard all year)” if it does not.</w:t>
+      </w:r>
+    </w:p>
+    <w:p>
+      <w:pPr>
+        <w:pStyle w:val="Heading2"/>
+      </w:pPr>
+      <w:r>
+        <w:t>United States</w:t>
       </w:r>
     </w:p>
     <w:tbl>
@@ -1709,6 +1717,651 @@
           <w:i/>
         </w:rPr>
         <w:t>Zones marked “(not used)” under With DST do not observe daylight saving time, so only the standard-time string applies. Daylight-saving rules shown reflect current U.S. law (spring forward 2nd Sunday of March, fall back 1st Sunday of November).</w:t>
+      </w:r>
+    </w:p>
+    <w:p>
+      <w:pPr>
+        <w:pStyle w:val="Heading2"/>
+      </w:pPr>
+      <w:r>
+        <w:t>Europe</w:t>
+      </w:r>
+    </w:p>
+    <w:p>
+      <w:r>
+        <w:t>Most of Europe observes EU daylight saving (forward on the last Sunday of March, back on the last Sunday of October). Countries that do not change their clocks are listed with a single standard-time value.</w:t>
+      </w:r>
+    </w:p>
+    <w:tbl>
+      <w:tblPr>
+        <w:tblStyle w:val="TableGrid"/>
+        <w:tblW w:type="auto" w:w="0"/>
+        <w:jc w:val="left"/>
+        <w:tblLook w:firstColumn="1" w:firstRow="1" w:lastColumn="0" w:lastRow="0" w:noHBand="0" w:noVBand="1" w:val="04A0"/>
+      </w:tblPr>
+      <w:tblGrid>
+        <w:gridCol w:w="2160"/>
+        <w:gridCol w:w="2160"/>
+        <w:gridCol w:w="2160"/>
+        <w:gridCol w:w="2160"/>
+      </w:tblGrid>
+      <w:tr>
+        <w:tc>
+          <w:tcPr>
+            <w:tcW w:type="dxa" w:w="1728"/>
+            <w:shd w:val="clear" w:color="auto" w:fill="F89048"/>
+          </w:tcPr>
+          <w:p>
+            <w:r/>
+            <w:r>
+              <w:rPr>
+                <w:b/>
+                <w:color w:val="000000"/>
+              </w:rPr>
+              <w:t>Zone</w:t>
+            </w:r>
+          </w:p>
+        </w:tc>
+        <w:tc>
+          <w:tcPr>
+            <w:tcW w:type="dxa" w:w="3744"/>
+            <w:shd w:val="clear" w:color="auto" w:fill="F89048"/>
+          </w:tcPr>
+          <w:p>
+            <w:r/>
+            <w:r>
+              <w:rPr>
+                <w:b/>
+                <w:color w:val="000000"/>
+              </w:rPr>
+              <w:t>Where it's used</w:t>
+            </w:r>
+          </w:p>
+        </w:tc>
+        <w:tc>
+          <w:tcPr>
+            <w:tcW w:type="dxa" w:w="2304"/>
+            <w:shd w:val="clear" w:color="auto" w:fill="F89048"/>
+          </w:tcPr>
+          <w:p>
+            <w:r/>
+            <w:r>
+              <w:rPr>
+                <w:b/>
+                <w:color w:val="000000"/>
+              </w:rPr>
+              <w:t>With DST</w:t>
+            </w:r>
+          </w:p>
+        </w:tc>
+        <w:tc>
+          <w:tcPr>
+            <w:tcW w:type="dxa" w:w="1872"/>
+            <w:shd w:val="clear" w:color="auto" w:fill="F89048"/>
+          </w:tcPr>
+          <w:p>
+            <w:r/>
+            <w:r>
+              <w:rPr>
+                <w:b/>
+                <w:color w:val="000000"/>
+              </w:rPr>
+              <w:t>Without DST (standard all year)</w:t>
+            </w:r>
+          </w:p>
+        </w:tc>
+      </w:tr>
+      <w:tr>
+        <w:tc>
+          <w:tcPr>
+            <w:tcW w:type="dxa" w:w="1728"/>
+          </w:tcPr>
+          <w:p>
+            <w:r/>
+            <w:r>
+              <w:t>Western European</w:t>
+            </w:r>
+          </w:p>
+        </w:tc>
+        <w:tc>
+          <w:tcPr>
+            <w:tcW w:type="dxa" w:w="3744"/>
+          </w:tcPr>
+          <w:p>
+            <w:r/>
+            <w:r>
+              <w:rPr>
+                <w:rFonts w:ascii="Consolas" w:hAnsi="Consolas"/>
+                <w:sz w:val="19"/>
+              </w:rPr>
+              <w:t>Portugal (mainland), Canary Islands</w:t>
+            </w:r>
+          </w:p>
+        </w:tc>
+        <w:tc>
+          <w:tcPr>
+            <w:tcW w:type="dxa" w:w="2304"/>
+          </w:tcPr>
+          <w:p>
+            <w:r/>
+            <w:r>
+              <w:rPr>
+                <w:rFonts w:ascii="Consolas" w:hAnsi="Consolas"/>
+                <w:sz w:val="19"/>
+              </w:rPr>
+              <w:t>WET0WEST,M3.5.0/1,M10.5.0</w:t>
+            </w:r>
+          </w:p>
+        </w:tc>
+        <w:tc>
+          <w:tcPr>
+            <w:tcW w:type="dxa" w:w="1872"/>
+          </w:tcPr>
+          <w:p>
+            <w:r/>
+            <w:r>
+              <w:rPr>
+                <w:rFonts w:ascii="Consolas" w:hAnsi="Consolas"/>
+                <w:sz w:val="19"/>
+              </w:rPr>
+              <w:t>WET0</w:t>
+            </w:r>
+          </w:p>
+        </w:tc>
+      </w:tr>
+      <w:tr>
+        <w:tc>
+          <w:tcPr>
+            <w:tcW w:type="dxa" w:w="1728"/>
+          </w:tcPr>
+          <w:p>
+            <w:r/>
+            <w:r>
+              <w:t>UK / Ireland</w:t>
+            </w:r>
+          </w:p>
+        </w:tc>
+        <w:tc>
+          <w:tcPr>
+            <w:tcW w:type="dxa" w:w="3744"/>
+          </w:tcPr>
+          <w:p>
+            <w:r/>
+            <w:r>
+              <w:rPr>
+                <w:rFonts w:ascii="Consolas" w:hAnsi="Consolas"/>
+                <w:sz w:val="19"/>
+              </w:rPr>
+              <w:t>United Kingdom, Ireland</w:t>
+            </w:r>
+          </w:p>
+        </w:tc>
+        <w:tc>
+          <w:tcPr>
+            <w:tcW w:type="dxa" w:w="2304"/>
+          </w:tcPr>
+          <w:p>
+            <w:r/>
+            <w:r>
+              <w:rPr>
+                <w:rFonts w:ascii="Consolas" w:hAnsi="Consolas"/>
+                <w:sz w:val="19"/>
+              </w:rPr>
+              <w:t>GMT0BST,M3.5.0/1,M10.5.0</w:t>
+            </w:r>
+          </w:p>
+        </w:tc>
+        <w:tc>
+          <w:tcPr>
+            <w:tcW w:type="dxa" w:w="1872"/>
+          </w:tcPr>
+          <w:p>
+            <w:r/>
+            <w:r>
+              <w:rPr>
+                <w:rFonts w:ascii="Consolas" w:hAnsi="Consolas"/>
+                <w:sz w:val="19"/>
+              </w:rPr>
+              <w:t>GMT0</w:t>
+            </w:r>
+          </w:p>
+        </w:tc>
+      </w:tr>
+      <w:tr>
+        <w:tc>
+          <w:tcPr>
+            <w:tcW w:type="dxa" w:w="1728"/>
+          </w:tcPr>
+          <w:p>
+            <w:r/>
+            <w:r>
+              <w:t>Central European</w:t>
+            </w:r>
+          </w:p>
+        </w:tc>
+        <w:tc>
+          <w:tcPr>
+            <w:tcW w:type="dxa" w:w="3744"/>
+          </w:tcPr>
+          <w:p>
+            <w:r/>
+            <w:r>
+              <w:rPr>
+                <w:rFonts w:ascii="Consolas" w:hAnsi="Consolas"/>
+                <w:sz w:val="19"/>
+              </w:rPr>
+              <w:t>France, Germany, Spain, Italy, Netherlands, Belgium, Poland, Sweden, Norway, Denmark, Switzerland, Austria, Czechia — most of central Europe</w:t>
+            </w:r>
+          </w:p>
+        </w:tc>
+        <w:tc>
+          <w:tcPr>
+            <w:tcW w:type="dxa" w:w="2304"/>
+          </w:tcPr>
+          <w:p>
+            <w:r/>
+            <w:r>
+              <w:rPr>
+                <w:rFonts w:ascii="Consolas" w:hAnsi="Consolas"/>
+                <w:sz w:val="19"/>
+              </w:rPr>
+              <w:t>CET-1CEST,M3.5.0,M10.5.0/3</w:t>
+            </w:r>
+          </w:p>
+        </w:tc>
+        <w:tc>
+          <w:tcPr>
+            <w:tcW w:type="dxa" w:w="1872"/>
+          </w:tcPr>
+          <w:p>
+            <w:r/>
+            <w:r>
+              <w:rPr>
+                <w:rFonts w:ascii="Consolas" w:hAnsi="Consolas"/>
+                <w:sz w:val="19"/>
+              </w:rPr>
+              <w:t>CET-1</w:t>
+            </w:r>
+          </w:p>
+        </w:tc>
+      </w:tr>
+      <w:tr>
+        <w:tc>
+          <w:tcPr>
+            <w:tcW w:type="dxa" w:w="1728"/>
+          </w:tcPr>
+          <w:p>
+            <w:r/>
+            <w:r>
+              <w:t>Eastern European</w:t>
+            </w:r>
+          </w:p>
+        </w:tc>
+        <w:tc>
+          <w:tcPr>
+            <w:tcW w:type="dxa" w:w="3744"/>
+          </w:tcPr>
+          <w:p>
+            <w:r/>
+            <w:r>
+              <w:rPr>
+                <w:rFonts w:ascii="Consolas" w:hAnsi="Consolas"/>
+                <w:sz w:val="19"/>
+              </w:rPr>
+              <w:t>Greece, Finland, Romania, Bulgaria, Estonia, Latvia, Lithuania, Ukraine</w:t>
+            </w:r>
+          </w:p>
+        </w:tc>
+        <w:tc>
+          <w:tcPr>
+            <w:tcW w:type="dxa" w:w="2304"/>
+          </w:tcPr>
+          <w:p>
+            <w:r/>
+            <w:r>
+              <w:rPr>
+                <w:rFonts w:ascii="Consolas" w:hAnsi="Consolas"/>
+                <w:sz w:val="19"/>
+              </w:rPr>
+              <w:t>EET-2EEST,M3.5.0/3,M10.5.0/4</w:t>
+            </w:r>
+          </w:p>
+        </w:tc>
+        <w:tc>
+          <w:tcPr>
+            <w:tcW w:type="dxa" w:w="1872"/>
+          </w:tcPr>
+          <w:p>
+            <w:r/>
+            <w:r>
+              <w:rPr>
+                <w:rFonts w:ascii="Consolas" w:hAnsi="Consolas"/>
+                <w:sz w:val="19"/>
+              </w:rPr>
+              <w:t>EET-2</w:t>
+            </w:r>
+          </w:p>
+        </w:tc>
+      </w:tr>
+      <w:tr>
+        <w:tc>
+          <w:tcPr>
+            <w:tcW w:type="dxa" w:w="1728"/>
+          </w:tcPr>
+          <w:p>
+            <w:r/>
+            <w:r>
+              <w:t>Azores</w:t>
+            </w:r>
+          </w:p>
+        </w:tc>
+        <w:tc>
+          <w:tcPr>
+            <w:tcW w:type="dxa" w:w="3744"/>
+          </w:tcPr>
+          <w:p>
+            <w:r/>
+            <w:r>
+              <w:t>Azores (Portugal)</w:t>
+            </w:r>
+          </w:p>
+        </w:tc>
+        <w:tc>
+          <w:tcPr>
+            <w:tcW w:type="dxa" w:w="2304"/>
+          </w:tcPr>
+          <w:p>
+            <w:r/>
+            <w:r>
+              <w:rPr>
+                <w:rFonts w:ascii="Consolas" w:hAnsi="Consolas"/>
+                <w:sz w:val="19"/>
+              </w:rPr>
+              <w:t>&lt;-01&gt;1&lt;+00&gt;,M3.5.0/0,M10.5.0/1</w:t>
+            </w:r>
+          </w:p>
+        </w:tc>
+        <w:tc>
+          <w:tcPr>
+            <w:tcW w:type="dxa" w:w="1872"/>
+          </w:tcPr>
+          <w:p>
+            <w:r/>
+            <w:r>
+              <w:rPr>
+                <w:rFonts w:ascii="Consolas" w:hAnsi="Consolas"/>
+                <w:sz w:val="19"/>
+              </w:rPr>
+              <w:t>&lt;-01&gt;1</w:t>
+            </w:r>
+          </w:p>
+        </w:tc>
+      </w:tr>
+      <w:tr>
+        <w:tc>
+          <w:tcPr>
+            <w:tcW w:type="dxa" w:w="1728"/>
+          </w:tcPr>
+          <w:p>
+            <w:r/>
+            <w:r>
+              <w:t>Iceland</w:t>
+            </w:r>
+          </w:p>
+        </w:tc>
+        <w:tc>
+          <w:tcPr>
+            <w:tcW w:type="dxa" w:w="3744"/>
+          </w:tcPr>
+          <w:p>
+            <w:r/>
+            <w:r>
+              <w:t>Iceland — no daylight saving</w:t>
+            </w:r>
+          </w:p>
+        </w:tc>
+        <w:tc>
+          <w:tcPr>
+            <w:tcW w:type="dxa" w:w="2304"/>
+          </w:tcPr>
+          <w:p>
+            <w:r/>
+            <w:r>
+              <w:t>(not used)</w:t>
+            </w:r>
+          </w:p>
+        </w:tc>
+        <w:tc>
+          <w:tcPr>
+            <w:tcW w:type="dxa" w:w="1872"/>
+          </w:tcPr>
+          <w:p>
+            <w:r/>
+            <w:r>
+              <w:rPr>
+                <w:rFonts w:ascii="Consolas" w:hAnsi="Consolas"/>
+                <w:sz w:val="19"/>
+              </w:rPr>
+              <w:t>GMT0</w:t>
+            </w:r>
+          </w:p>
+        </w:tc>
+      </w:tr>
+      <w:tr>
+        <w:tc>
+          <w:tcPr>
+            <w:tcW w:type="dxa" w:w="1728"/>
+          </w:tcPr>
+          <w:p>
+            <w:r/>
+            <w:r>
+              <w:t>Kaliningrad</w:t>
+            </w:r>
+          </w:p>
+        </w:tc>
+        <w:tc>
+          <w:tcPr>
+            <w:tcW w:type="dxa" w:w="3744"/>
+          </w:tcPr>
+          <w:p>
+            <w:r/>
+            <w:r>
+              <w:rPr>
+                <w:rFonts w:ascii="Consolas" w:hAnsi="Consolas"/>
+                <w:sz w:val="19"/>
+              </w:rPr>
+              <w:t>Kaliningrad, Russia — no daylight saving</w:t>
+            </w:r>
+          </w:p>
+        </w:tc>
+        <w:tc>
+          <w:tcPr>
+            <w:tcW w:type="dxa" w:w="2304"/>
+          </w:tcPr>
+          <w:p>
+            <w:r/>
+            <w:r>
+              <w:t>(not used)</w:t>
+            </w:r>
+          </w:p>
+        </w:tc>
+        <w:tc>
+          <w:tcPr>
+            <w:tcW w:type="dxa" w:w="1872"/>
+          </w:tcPr>
+          <w:p>
+            <w:r/>
+            <w:r>
+              <w:rPr>
+                <w:rFonts w:ascii="Consolas" w:hAnsi="Consolas"/>
+                <w:sz w:val="19"/>
+              </w:rPr>
+              <w:t>EET-2</w:t>
+            </w:r>
+          </w:p>
+        </w:tc>
+      </w:tr>
+      <w:tr>
+        <w:tc>
+          <w:tcPr>
+            <w:tcW w:type="dxa" w:w="1728"/>
+          </w:tcPr>
+          <w:p>
+            <w:r/>
+            <w:r>
+              <w:t>Moscow</w:t>
+            </w:r>
+          </w:p>
+        </w:tc>
+        <w:tc>
+          <w:tcPr>
+            <w:tcW w:type="dxa" w:w="3744"/>
+          </w:tcPr>
+          <w:p>
+            <w:r/>
+            <w:r>
+              <w:t>Moscow / western Russia — no daylight saving</w:t>
+            </w:r>
+          </w:p>
+        </w:tc>
+        <w:tc>
+          <w:tcPr>
+            <w:tcW w:type="dxa" w:w="2304"/>
+          </w:tcPr>
+          <w:p>
+            <w:r/>
+            <w:r>
+              <w:t>(not used)</w:t>
+            </w:r>
+          </w:p>
+        </w:tc>
+        <w:tc>
+          <w:tcPr>
+            <w:tcW w:type="dxa" w:w="1872"/>
+          </w:tcPr>
+          <w:p>
+            <w:r/>
+            <w:r>
+              <w:rPr>
+                <w:rFonts w:ascii="Consolas" w:hAnsi="Consolas"/>
+                <w:sz w:val="19"/>
+              </w:rPr>
+              <w:t>MSK-3</w:t>
+            </w:r>
+          </w:p>
+        </w:tc>
+      </w:tr>
+      <w:tr>
+        <w:tc>
+          <w:tcPr>
+            <w:tcW w:type="dxa" w:w="1728"/>
+          </w:tcPr>
+          <w:p>
+            <w:r/>
+            <w:r>
+              <w:t>Belarus</w:t>
+            </w:r>
+          </w:p>
+        </w:tc>
+        <w:tc>
+          <w:tcPr>
+            <w:tcW w:type="dxa" w:w="3744"/>
+          </w:tcPr>
+          <w:p>
+            <w:r/>
+            <w:r>
+              <w:rPr>
+                <w:rFonts w:ascii="Consolas" w:hAnsi="Consolas"/>
+                <w:sz w:val="19"/>
+              </w:rPr>
+              <w:t>Minsk, Belarus — no daylight saving</w:t>
+            </w:r>
+          </w:p>
+        </w:tc>
+        <w:tc>
+          <w:tcPr>
+            <w:tcW w:type="dxa" w:w="2304"/>
+          </w:tcPr>
+          <w:p>
+            <w:r/>
+            <w:r>
+              <w:t>(not used)</w:t>
+            </w:r>
+          </w:p>
+        </w:tc>
+        <w:tc>
+          <w:tcPr>
+            <w:tcW w:type="dxa" w:w="1872"/>
+          </w:tcPr>
+          <w:p>
+            <w:r/>
+            <w:r>
+              <w:rPr>
+                <w:rFonts w:ascii="Consolas" w:hAnsi="Consolas"/>
+                <w:sz w:val="19"/>
+              </w:rPr>
+              <w:t>&lt;+03&gt;-3</w:t>
+            </w:r>
+          </w:p>
+        </w:tc>
+      </w:tr>
+      <w:tr>
+        <w:tc>
+          <w:tcPr>
+            <w:tcW w:type="dxa" w:w="1728"/>
+          </w:tcPr>
+          <w:p>
+            <w:r/>
+            <w:r>
+              <w:t>Turkey</w:t>
+            </w:r>
+          </w:p>
+        </w:tc>
+        <w:tc>
+          <w:tcPr>
+            <w:tcW w:type="dxa" w:w="3744"/>
+          </w:tcPr>
+          <w:p>
+            <w:r/>
+            <w:r>
+              <w:t>Türkiye — no daylight saving</w:t>
+            </w:r>
+          </w:p>
+        </w:tc>
+        <w:tc>
+          <w:tcPr>
+            <w:tcW w:type="dxa" w:w="2304"/>
+          </w:tcPr>
+          <w:p>
+            <w:r/>
+            <w:r>
+              <w:t>(not used)</w:t>
+            </w:r>
+          </w:p>
+        </w:tc>
+        <w:tc>
+          <w:tcPr>
+            <w:tcW w:type="dxa" w:w="1872"/>
+          </w:tcPr>
+          <w:p>
+            <w:r/>
+            <w:r>
+              <w:rPr>
+                <w:rFonts w:ascii="Consolas" w:hAnsi="Consolas"/>
+                <w:sz w:val="19"/>
+              </w:rPr>
+              <w:t>&lt;+03&gt;-3</w:t>
+            </w:r>
+          </w:p>
+        </w:tc>
+      </w:tr>
+    </w:tbl>
+    <w:p>
+      <w:r>
+        <w:rPr>
+          <w:i/>
+        </w:rPr>
+        <w:t>Zones marked “(not used)” under With DST do not change their clocks. POSIX values are taken directly from the IANA time zone database.</w:t>
       </w:r>
     </w:p>
     <w:p>

</xml_diff>

<commit_message>
Update Ropener User Guide to Firmware 2.4.0
- Changed firmware version from 2.3.0 to 2.4.0 in both PDF and Markdown user guides.
- Enhanced daily schedule functionality to include sunrise/sunset options.
- Updated instructions for setting up the daily schedule, including new steps for latitude and longitude input.
- Added notes regarding the need for internet connection for accurate timekeeping and the behavior of the sun schedule.
- Revised troubleshooting section to address potential issues with sun schedule timing.
- Improved formatting and clarity throughout the user guides.
</commit_message>
<xml_diff>
--- a/docs/Ropener User Guide.docx
+++ b/docs/Ropener User Guide.docx
@@ -76,7 +76,7 @@
           <w:i/>
           <w:color w:val="595959"/>
         </w:rPr>
-        <w:t>Firmware 2.3.0</w:t>
+        <w:t>Firmware 2.4.0</w:t>
       </w:r>
     </w:p>
     <w:p>
@@ -90,7 +90,7 @@
     <w:p/>
     <w:p>
       <w:r>
-        <w:t>Ropener is a Wi-Fi connected curtain/cover controller. It pulls a beaded rope with a small stepper motor to open and close your curtains. You can control it from any web browser on your network — no Home Assistant or cloud account required — or pair it with Home Assistant if you use one. It supports a daily open/close schedule, automatic position calibration, and several tuning options.</w:t>
+        <w:t>Ropener is a Wi-Fi connected curtain/cover controller. It pulls a beaded rope with a small stepper motor to open and close your curtains. You can control it from any web browser on your network — no Home Assistant or cloud account required — or pair it with Home Assistant if you use one. It supports a daily open/close schedule (by fixed clock times or sunrise/sunset), automatic position calibration, and several tuning options.</w:t>
       </w:r>
     </w:p>
     <w:p>
@@ -154,7 +154,7 @@
         <w:t xml:space="preserve">Daily schedule: </w:t>
       </w:r>
       <w:r>
-        <w:t>set a time to open and a time to close automatically every day.</w:t>
+        <w:t>open and close automatically every day — at fixed clock times, or following sunrise and sunset.</w:t>
       </w:r>
     </w:p>
     <w:p>
@@ -716,7 +716,48 @@
     </w:p>
     <w:p>
       <w:r>
-        <w:t>The device can open and close the curtain automatically at set times every day. Four controls on the web page work together:</w:t>
+        <w:t>The device can open and close the curtain automatically every day. There are two scheduling modes — pick the one you prefer:</w:t>
+      </w:r>
+    </w:p>
+    <w:p>
+      <w:pPr>
+        <w:pStyle w:val="ListBullet"/>
+      </w:pPr>
+      <w:r>
+        <w:rPr>
+          <w:b/>
+        </w:rPr>
+        <w:t xml:space="preserve">Fixed times — </w:t>
+      </w:r>
+      <w:r>
+        <w:t>open and close at clock times you choose (e.g. 07:00 and 21:00).</w:t>
+      </w:r>
+    </w:p>
+    <w:p>
+      <w:pPr>
+        <w:pStyle w:val="ListBullet"/>
+      </w:pPr>
+      <w:r>
+        <w:rPr>
+          <w:b/>
+        </w:rPr>
+        <w:t xml:space="preserve">Sunrise / sunset — </w:t>
+      </w:r>
+      <w:r>
+        <w:t>open at sunrise and close at sunset, so the curtain follows the daylight as it shifts through the seasons.</w:t>
+      </w:r>
+    </w:p>
+    <w:p>
+      <w:r>
+        <w:t>“Schedule Enabled” is the master on/off for whichever mode is active. The “Sun Schedule” switch chooses between the two: OFF uses the fixed times, ON uses sunrise/sunset. Both modes run on local time, so set your Timezone first (Section 7).</w:t>
+      </w:r>
+    </w:p>
+    <w:p>
+      <w:pPr>
+        <w:pStyle w:val="Heading2"/>
+      </w:pPr>
+      <w:r>
+        <w:t>Fixed times (default)</w:t>
       </w:r>
     </w:p>
     <w:tbl>
@@ -820,6 +861,30 @@
           <w:p>
             <w:r/>
             <w:r>
+              <w:t>Sun Schedule</w:t>
+            </w:r>
+          </w:p>
+        </w:tc>
+        <w:tc>
+          <w:tcPr>
+            <w:tcW w:type="dxa" w:w="6768"/>
+          </w:tcPr>
+          <w:p>
+            <w:r/>
+            <w:r>
+              <w:t>Leave this OFF to use fixed times.</w:t>
+            </w:r>
+          </w:p>
+        </w:tc>
+      </w:tr>
+      <w:tr>
+        <w:tc>
+          <w:tcPr>
+            <w:tcW w:type="dxa" w:w="2448"/>
+          </w:tcPr>
+          <w:p>
+            <w:r/>
+            <w:r>
               <w:t>Schedule Enabled</w:t>
             </w:r>
           </w:p>
@@ -895,6 +960,328 @@
         <w:pStyle w:val="ListNumber"/>
       </w:pPr>
       <w:r>
+        <w:t>Make sure Sun Schedule is OFF.</w:t>
+      </w:r>
+    </w:p>
+    <w:p>
+      <w:pPr>
+        <w:pStyle w:val="ListNumber"/>
+      </w:pPr>
+      <w:r>
+        <w:t>Turn Schedule Enabled ON.</w:t>
+      </w:r>
+    </w:p>
+    <w:p>
+      <w:pPr>
+        <w:pStyle w:val="Heading2"/>
+      </w:pPr>
+      <w:r>
+        <w:t>Sunrise / sunset (Sun Schedule)</w:t>
+      </w:r>
+    </w:p>
+    <w:p>
+      <w:r>
+        <w:t>Turn “Sun Schedule” ON to follow the sun instead of the clock. The curtain opens at sunrise and closes at sunset for your location, recalculated every day so it tracks the changing seasons automatically — no need to adjust times by hand.</w:t>
+      </w:r>
+    </w:p>
+    <w:p>
+      <w:r>
+        <w:t>For this to be accurate, the device needs to know where it is. Enter your Latitude and Longitude in decimal degrees (north and east are positive; south and west are negative). You can copy these from any maps app — for example, New York is about Latitude 40.71, Longitude -74.01.</w:t>
+      </w:r>
+    </w:p>
+    <w:tbl>
+      <w:tblPr>
+        <w:tblStyle w:val="TableGrid"/>
+        <w:tblW w:type="auto" w:w="0"/>
+        <w:jc w:val="left"/>
+        <w:tblLook w:firstColumn="1" w:firstRow="1" w:lastColumn="0" w:lastRow="0" w:noHBand="0" w:noVBand="1" w:val="04A0"/>
+      </w:tblPr>
+      <w:tblGrid>
+        <w:gridCol w:w="4320"/>
+        <w:gridCol w:w="4320"/>
+      </w:tblGrid>
+      <w:tr>
+        <w:tc>
+          <w:tcPr>
+            <w:tcW w:type="dxa" w:w="2448"/>
+            <w:shd w:val="clear" w:color="auto" w:fill="F89048"/>
+          </w:tcPr>
+          <w:p>
+            <w:r/>
+            <w:r>
+              <w:rPr>
+                <w:b/>
+                <w:color w:val="000000"/>
+              </w:rPr>
+              <w:t>Control</w:t>
+            </w:r>
+          </w:p>
+        </w:tc>
+        <w:tc>
+          <w:tcPr>
+            <w:tcW w:type="dxa" w:w="6768"/>
+            <w:shd w:val="clear" w:color="auto" w:fill="F89048"/>
+          </w:tcPr>
+          <w:p>
+            <w:r/>
+            <w:r>
+              <w:rPr>
+                <w:b/>
+                <w:color w:val="000000"/>
+              </w:rPr>
+              <w:t>What to set</w:t>
+            </w:r>
+          </w:p>
+        </w:tc>
+      </w:tr>
+      <w:tr>
+        <w:tc>
+          <w:tcPr>
+            <w:tcW w:type="dxa" w:w="2448"/>
+          </w:tcPr>
+          <w:p>
+            <w:r/>
+            <w:r>
+              <w:t>Sun Schedule</w:t>
+            </w:r>
+          </w:p>
+        </w:tc>
+        <w:tc>
+          <w:tcPr>
+            <w:tcW w:type="dxa" w:w="6768"/>
+          </w:tcPr>
+          <w:p>
+            <w:r/>
+            <w:r>
+              <w:t>Turn this ON to use sunrise/sunset.</w:t>
+            </w:r>
+          </w:p>
+        </w:tc>
+      </w:tr>
+      <w:tr>
+        <w:tc>
+          <w:tcPr>
+            <w:tcW w:type="dxa" w:w="2448"/>
+          </w:tcPr>
+          <w:p>
+            <w:r/>
+            <w:r>
+              <w:t>Latitude</w:t>
+            </w:r>
+          </w:p>
+        </w:tc>
+        <w:tc>
+          <w:tcPr>
+            <w:tcW w:type="dxa" w:w="6768"/>
+          </w:tcPr>
+          <w:p>
+            <w:r/>
+            <w:r>
+              <w:t>Your location's latitude in decimal degrees (e.g. 40.71).</w:t>
+            </w:r>
+          </w:p>
+        </w:tc>
+      </w:tr>
+      <w:tr>
+        <w:tc>
+          <w:tcPr>
+            <w:tcW w:type="dxa" w:w="2448"/>
+          </w:tcPr>
+          <w:p>
+            <w:r/>
+            <w:r>
+              <w:t>Longitude</w:t>
+            </w:r>
+          </w:p>
+        </w:tc>
+        <w:tc>
+          <w:tcPr>
+            <w:tcW w:type="dxa" w:w="6768"/>
+          </w:tcPr>
+          <w:p>
+            <w:r/>
+            <w:r>
+              <w:t>Your location's longitude in decimal degrees (e.g. -74.01).</w:t>
+            </w:r>
+          </w:p>
+        </w:tc>
+      </w:tr>
+      <w:tr>
+        <w:tc>
+          <w:tcPr>
+            <w:tcW w:type="dxa" w:w="2448"/>
+          </w:tcPr>
+          <w:p>
+            <w:r/>
+            <w:r>
+              <w:t>Sun Open Offset</w:t>
+            </w:r>
+          </w:p>
+        </w:tc>
+        <w:tc>
+          <w:tcPr>
+            <w:tcW w:type="dxa" w:w="6768"/>
+          </w:tcPr>
+          <w:p>
+            <w:r/>
+            <w:r>
+              <w:t>Minutes to shift the morning open relative to sunrise (see below).</w:t>
+            </w:r>
+          </w:p>
+        </w:tc>
+      </w:tr>
+      <w:tr>
+        <w:tc>
+          <w:tcPr>
+            <w:tcW w:type="dxa" w:w="2448"/>
+          </w:tcPr>
+          <w:p>
+            <w:r/>
+            <w:r>
+              <w:t>Sun Close Offset</w:t>
+            </w:r>
+          </w:p>
+        </w:tc>
+        <w:tc>
+          <w:tcPr>
+            <w:tcW w:type="dxa" w:w="6768"/>
+          </w:tcPr>
+          <w:p>
+            <w:r/>
+            <w:r>
+              <w:t>Minutes to shift the evening close relative to sunset (see below).</w:t>
+            </w:r>
+          </w:p>
+        </w:tc>
+      </w:tr>
+      <w:tr>
+        <w:tc>
+          <w:tcPr>
+            <w:tcW w:type="dxa" w:w="2448"/>
+          </w:tcPr>
+          <w:p>
+            <w:r/>
+            <w:r>
+              <w:t>Schedule Enabled</w:t>
+            </w:r>
+          </w:p>
+        </w:tc>
+        <w:tc>
+          <w:tcPr>
+            <w:tcW w:type="dxa" w:w="6768"/>
+          </w:tcPr>
+          <w:p>
+            <w:r/>
+            <w:r>
+              <w:t>Turn this ON to run the schedule.</w:t>
+            </w:r>
+          </w:p>
+        </w:tc>
+      </w:tr>
+      <w:tr>
+        <w:tc>
+          <w:tcPr>
+            <w:tcW w:type="dxa" w:w="2448"/>
+          </w:tcPr>
+          <w:p>
+            <w:r/>
+            <w:r>
+              <w:t>Timezone</w:t>
+            </w:r>
+          </w:p>
+        </w:tc>
+        <w:tc>
+          <w:tcPr>
+            <w:tcW w:type="dxa" w:w="6768"/>
+          </w:tcPr>
+          <w:p>
+            <w:r/>
+            <w:r>
+              <w:t>Your local timezone (see Section 7).</w:t>
+            </w:r>
+          </w:p>
+        </w:tc>
+      </w:tr>
+    </w:tbl>
+    <w:p>
+      <w:r>
+        <w:t>Offsets let you open or close a little before or after the sun, in minutes:</w:t>
+      </w:r>
+    </w:p>
+    <w:p>
+      <w:pPr>
+        <w:pStyle w:val="ListBullet"/>
+      </w:pPr>
+      <w:r>
+        <w:t>A positive offset is after the event; a negative offset is before it.</w:t>
+      </w:r>
+    </w:p>
+    <w:p>
+      <w:pPr>
+        <w:pStyle w:val="ListBullet"/>
+      </w:pPr>
+      <w:r>
+        <w:t>To open 30 minutes after sunrise, set Sun Open Offset to 30.</w:t>
+      </w:r>
+    </w:p>
+    <w:p>
+      <w:pPr>
+        <w:pStyle w:val="ListBullet"/>
+      </w:pPr>
+      <w:r>
+        <w:t>To close 30 minutes before sunset, set Sun Close Offset to -30.</w:t>
+      </w:r>
+    </w:p>
+    <w:p>
+      <w:pPr>
+        <w:pStyle w:val="ListBullet"/>
+      </w:pPr>
+      <w:r>
+        <w:t>Leave both at 0 to open exactly at sunrise and close exactly at sunset.</w:t>
+      </w:r>
+    </w:p>
+    <w:p>
+      <w:r>
+        <w:t>Steps:</w:t>
+      </w:r>
+    </w:p>
+    <w:p>
+      <w:pPr>
+        <w:pStyle w:val="ListNumber"/>
+      </w:pPr>
+      <w:r>
+        <w:t>Set your Timezone (Section 7).</w:t>
+      </w:r>
+    </w:p>
+    <w:p>
+      <w:pPr>
+        <w:pStyle w:val="ListNumber"/>
+      </w:pPr>
+      <w:r>
+        <w:t>Enter your Latitude and Longitude.</w:t>
+      </w:r>
+    </w:p>
+    <w:p>
+      <w:pPr>
+        <w:pStyle w:val="ListNumber"/>
+      </w:pPr>
+      <w:r>
+        <w:t>Optionally set the open/close offsets.</w:t>
+      </w:r>
+    </w:p>
+    <w:p>
+      <w:pPr>
+        <w:pStyle w:val="ListNumber"/>
+      </w:pPr>
+      <w:r>
+        <w:t>Turn Sun Schedule ON.</w:t>
+      </w:r>
+    </w:p>
+    <w:p>
+      <w:pPr>
+        <w:pStyle w:val="ListNumber"/>
+      </w:pPr>
+      <w:r>
         <w:t>Turn Schedule Enabled ON.</w:t>
       </w:r>
     </w:p>
@@ -906,7 +1293,7 @@
         <w:t xml:space="preserve">Notes: </w:t>
       </w:r>
       <w:r>
-        <w:t>The schedule needs an internet connection to keep accurate time. Scheduled moves are skipped while the device is homing. The schedule is off by default, and all four settings are remembered across reboots.</w:t>
+        <w:t>Both schedules need an internet connection to keep accurate time. Scheduled moves are skipped while the device is homing, and every schedule setting is remembered across reboots. With Sun Schedule ON the fixed Open Time / Close Time are ignored. If you leave Latitude and Longitude at 0, sunrise/sunset will not match your location — set them before relying on the sun schedule.</w:t>
       </w:r>
     </w:p>
     <w:p>
@@ -3021,6 +3408,34 @@
           <w:p>
             <w:r/>
             <w:r>
+              <w:t>Sun schedule opens/closes at the wrong time</w:t>
+            </w:r>
+          </w:p>
+        </w:tc>
+        <w:tc>
+          <w:tcPr>
+            <w:tcW w:type="dxa" w:w="6192"/>
+          </w:tcPr>
+          <w:p>
+            <w:r/>
+            <w:r>
+              <w:rPr>
+                <w:rFonts w:ascii="Consolas" w:hAnsi="Consolas"/>
+                <w:sz w:val="19"/>
+              </w:rPr>
+              <w:t>Set Latitude and Longitude for your location and check the Timezone (Section 7/8). With Sun Schedule ON, the fixed Open/Close times are ignored.</w:t>
+            </w:r>
+          </w:p>
+        </w:tc>
+      </w:tr>
+      <w:tr>
+        <w:tc>
+          <w:tcPr>
+            <w:tcW w:type="dxa" w:w="3024"/>
+          </w:tcPr>
+          <w:p>
+            <w:r/>
+            <w:r>
               <w:t>Homing motor doesn't stop on its own</w:t>
             </w:r>
           </w:p>
@@ -3210,7 +3625,7 @@
           <w:p>
             <w:r/>
             <w:r>
-              <w:t>Daily schedule times.</w:t>
+              <w:t>Daily schedule times (fixed-time mode).</w:t>
             </w:r>
           </w:p>
         </w:tc>
@@ -3235,6 +3650,78 @@
             <w:r/>
             <w:r>
               <w:t>Turn the daily schedule on/off.</w:t>
+            </w:r>
+          </w:p>
+        </w:tc>
+      </w:tr>
+      <w:tr>
+        <w:tc>
+          <w:tcPr>
+            <w:tcW w:type="dxa" w:w="3456"/>
+          </w:tcPr>
+          <w:p>
+            <w:r/>
+            <w:r>
+              <w:t>Sun Schedule</w:t>
+            </w:r>
+          </w:p>
+        </w:tc>
+        <w:tc>
+          <w:tcPr>
+            <w:tcW w:type="dxa" w:w="5760"/>
+          </w:tcPr>
+          <w:p>
+            <w:r/>
+            <w:r>
+              <w:t>Switch between fixed-time and sunrise/sunset scheduling.</w:t>
+            </w:r>
+          </w:p>
+        </w:tc>
+      </w:tr>
+      <w:tr>
+        <w:tc>
+          <w:tcPr>
+            <w:tcW w:type="dxa" w:w="3456"/>
+          </w:tcPr>
+          <w:p>
+            <w:r/>
+            <w:r>
+              <w:t>Latitude / Longitude</w:t>
+            </w:r>
+          </w:p>
+        </w:tc>
+        <w:tc>
+          <w:tcPr>
+            <w:tcW w:type="dxa" w:w="5760"/>
+          </w:tcPr>
+          <w:p>
+            <w:r/>
+            <w:r>
+              <w:t>Your location used to compute sunrise/sunset.</w:t>
+            </w:r>
+          </w:p>
+        </w:tc>
+      </w:tr>
+      <w:tr>
+        <w:tc>
+          <w:tcPr>
+            <w:tcW w:type="dxa" w:w="3456"/>
+          </w:tcPr>
+          <w:p>
+            <w:r/>
+            <w:r>
+              <w:t>Sun Open Offset / Sun Close Offset</w:t>
+            </w:r>
+          </w:p>
+        </w:tc>
+        <w:tc>
+          <w:tcPr>
+            <w:tcW w:type="dxa" w:w="5760"/>
+          </w:tcPr>
+          <w:p>
+            <w:r/>
+            <w:r>
+              <w:t>Minutes to shift open/close relative to sunrise/sunset.</w:t>
             </w:r>
           </w:p>
         </w:tc>

</xml_diff>